<commit_message>
Refined UC Pay Order and Activity Diagram
</commit_message>
<xml_diff>
--- a/RequirementAnalysis/UCSpec/word/20239715_NguyenTienDat_PayOrder.docx
+++ b/RequirementAnalysis/UCSpec/word/20239715_NguyenTienDat_PayOrder.docx
@@ -117,47 +117,11 @@
           <w:szCs w:val="24"/>
         </w:rPr>
       </w:pPr>
-      <w:proofErr w:type="gramStart"/>
       <w:r>
         <w:rPr>
           <w:szCs w:val="24"/>
         </w:rPr>
-        <w:t>This use</w:t>
-      </w:r>
-      <w:proofErr w:type="gramEnd"/>
-      <w:r>
-        <w:rPr>
-          <w:szCs w:val="24"/>
-        </w:rPr>
-        <w:t xml:space="preserve"> case describes the interaction between AIMS software with the customer and </w:t>
-      </w:r>
-      <w:proofErr w:type="spellStart"/>
-      <w:r>
-        <w:rPr>
-          <w:szCs w:val="24"/>
-        </w:rPr>
-        <w:t>VietQR</w:t>
-      </w:r>
-      <w:proofErr w:type="spellEnd"/>
-      <w:r>
-        <w:rPr>
-          <w:szCs w:val="24"/>
-        </w:rPr>
-        <w:t xml:space="preserve"> when the customer wishes to </w:t>
-      </w:r>
-      <w:proofErr w:type="gramStart"/>
-      <w:r>
-        <w:rPr>
-          <w:szCs w:val="24"/>
-        </w:rPr>
-        <w:t>pay</w:t>
-      </w:r>
-      <w:proofErr w:type="gramEnd"/>
-      <w:r>
-        <w:rPr>
-          <w:szCs w:val="24"/>
-        </w:rPr>
-        <w:t xml:space="preserve"> the order</w:t>
+        <w:t>This use case describes the interaction between AIMS software with the customer and VietQR when the customer wishes to pay the order</w:t>
       </w:r>
     </w:p>
     <w:p>
@@ -216,14 +180,12 @@
           <w:szCs w:val="24"/>
         </w:rPr>
       </w:pPr>
-      <w:proofErr w:type="spellStart"/>
       <w:r>
         <w:rPr>
           <w:szCs w:val="24"/>
         </w:rPr>
         <w:t>VietQr</w:t>
       </w:r>
-      <w:proofErr w:type="spellEnd"/>
     </w:p>
     <w:p>
       <w:pPr>
@@ -353,7 +315,7 @@
         <w:rPr>
           <w:szCs w:val="24"/>
         </w:rPr>
-        <w:t>Customer requests to pay order by QR code</w:t>
+        <w:t>Customer requests to pay order</w:t>
       </w:r>
     </w:p>
     <w:p>
@@ -426,16 +388,8 @@
         <w:rPr>
           <w:szCs w:val="24"/>
         </w:rPr>
-        <w:t xml:space="preserve">oken API from </w:t>
-      </w:r>
-      <w:proofErr w:type="spellStart"/>
-      <w:r>
-        <w:rPr>
-          <w:szCs w:val="24"/>
-        </w:rPr>
-        <w:t>VietQR</w:t>
-      </w:r>
-      <w:proofErr w:type="spellEnd"/>
+        <w:t>oken API from VietQR</w:t>
+      </w:r>
     </w:p>
     <w:p>
       <w:pPr>
@@ -449,19 +403,11 @@
           <w:szCs w:val="32"/>
         </w:rPr>
       </w:pPr>
-      <w:proofErr w:type="spellStart"/>
       <w:r>
         <w:rPr>
           <w:szCs w:val="32"/>
         </w:rPr>
-        <w:t>VietQR</w:t>
-      </w:r>
-      <w:proofErr w:type="spellEnd"/>
-      <w:r>
-        <w:rPr>
-          <w:szCs w:val="32"/>
-        </w:rPr>
-        <w:t xml:space="preserve"> sends the access token to AIMS software</w:t>
+        <w:t>VietQR sends the access token to AIMS software</w:t>
       </w:r>
     </w:p>
     <w:p>
@@ -480,21 +426,7 @@
         <w:rPr>
           <w:szCs w:val="32"/>
         </w:rPr>
-        <w:t xml:space="preserve">AIMS software calls the API of </w:t>
-      </w:r>
-      <w:proofErr w:type="spellStart"/>
-      <w:r>
-        <w:rPr>
-          <w:szCs w:val="32"/>
-        </w:rPr>
-        <w:t>VietQR</w:t>
-      </w:r>
-      <w:proofErr w:type="spellEnd"/>
-      <w:r>
-        <w:rPr>
-          <w:szCs w:val="32"/>
-        </w:rPr>
-        <w:t xml:space="preserve"> to generate the QR code</w:t>
+        <w:t>AIMS software calls the API of VietQR to generate the QR code</w:t>
       </w:r>
       <w:r>
         <w:rPr>
@@ -515,19 +447,11 @@
           <w:szCs w:val="32"/>
         </w:rPr>
       </w:pPr>
-      <w:proofErr w:type="spellStart"/>
       <w:r>
         <w:rPr>
           <w:szCs w:val="32"/>
         </w:rPr>
-        <w:t>VietQR</w:t>
-      </w:r>
-      <w:proofErr w:type="spellEnd"/>
-      <w:r>
-        <w:rPr>
-          <w:szCs w:val="32"/>
-        </w:rPr>
-        <w:t xml:space="preserve"> </w:t>
+        <w:t xml:space="preserve">VietQR </w:t>
       </w:r>
       <w:r>
         <w:rPr>
@@ -564,7 +488,19 @@
         <w:rPr>
           <w:szCs w:val="32"/>
         </w:rPr>
-        <w:t xml:space="preserve"> (see Table 3)</w:t>
+        <w:t xml:space="preserve"> (see Table </w:t>
+      </w:r>
+      <w:r>
+        <w:rPr>
+          <w:szCs w:val="32"/>
+        </w:rPr>
+        <w:t>2</w:t>
+      </w:r>
+      <w:r>
+        <w:rPr>
+          <w:szCs w:val="32"/>
+        </w:rPr>
+        <w:t>)</w:t>
       </w:r>
     </w:p>
     <w:p>
@@ -583,39 +519,7 @@
         <w:rPr>
           <w:szCs w:val="32"/>
         </w:rPr>
-        <w:t xml:space="preserve">AIMS software calls the </w:t>
-      </w:r>
-      <w:proofErr w:type="spellStart"/>
-      <w:r>
-        <w:rPr>
-          <w:szCs w:val="32"/>
-        </w:rPr>
-        <w:t>VietQR</w:t>
-      </w:r>
-      <w:proofErr w:type="spellEnd"/>
-      <w:r>
-        <w:rPr>
-          <w:szCs w:val="32"/>
-        </w:rPr>
-        <w:t xml:space="preserve"> Test Callback API to simulate a </w:t>
-      </w:r>
-      <w:r>
-        <w:rPr>
-          <w:szCs w:val="32"/>
-        </w:rPr>
-        <w:t xml:space="preserve">successful </w:t>
-      </w:r>
-      <w:r>
-        <w:rPr>
-          <w:szCs w:val="32"/>
-        </w:rPr>
-        <w:t>payment transactio</w:t>
-      </w:r>
-      <w:r>
-        <w:rPr>
-          <w:szCs w:val="32"/>
-        </w:rPr>
-        <w:t>n</w:t>
+        <w:t>Customer triggers the Test Callback API</w:t>
       </w:r>
     </w:p>
     <w:p>
@@ -630,19 +534,35 @@
           <w:szCs w:val="32"/>
         </w:rPr>
       </w:pPr>
-      <w:proofErr w:type="spellStart"/>
       <w:r>
         <w:rPr>
           <w:szCs w:val="32"/>
         </w:rPr>
-        <w:t>VietQR</w:t>
-      </w:r>
-      <w:proofErr w:type="spellEnd"/>
+        <w:t xml:space="preserve">AIMS software calls the VietQR Test Callback API to simulate a </w:t>
+      </w:r>
       <w:r>
         <w:rPr>
           <w:szCs w:val="32"/>
         </w:rPr>
-        <w:t xml:space="preserve"> calls AIMS’s Get Token API</w:t>
+        <w:t xml:space="preserve">successful </w:t>
+      </w:r>
+      <w:r>
+        <w:rPr>
+          <w:szCs w:val="32"/>
+        </w:rPr>
+        <w:t>payment transactio</w:t>
+      </w:r>
+      <w:r>
+        <w:rPr>
+          <w:szCs w:val="32"/>
+        </w:rPr>
+        <w:t>n</w:t>
+      </w:r>
+      <w:r>
+        <w:rPr>
+          <w:szCs w:val="32"/>
+        </w:rPr>
+        <w:t xml:space="preserve"> (see Table 3)</w:t>
       </w:r>
     </w:p>
     <w:p>
@@ -661,60 +581,13 @@
         <w:rPr>
           <w:szCs w:val="32"/>
         </w:rPr>
-        <w:t xml:space="preserve">AIMS returns an access token to </w:t>
-      </w:r>
-      <w:proofErr w:type="spellStart"/>
+        <w:t>VietQR sends a payment callback to AIMS software</w:t>
+      </w:r>
       <w:r>
         <w:rPr>
           <w:szCs w:val="32"/>
         </w:rPr>
-        <w:t>VietQR</w:t>
-      </w:r>
-      <w:proofErr w:type="spellEnd"/>
-    </w:p>
-    <w:p>
-      <w:pPr>
-        <w:pStyle w:val="ListParagraph"/>
-        <w:numPr>
-          <w:ilvl w:val="0"/>
-          <w:numId w:val="2"/>
-        </w:numPr>
-        <w:spacing w:after="120"/>
-        <w:rPr>
-          <w:szCs w:val="32"/>
-        </w:rPr>
-      </w:pPr>
-      <w:proofErr w:type="spellStart"/>
-      <w:r>
-        <w:rPr>
-          <w:szCs w:val="32"/>
-        </w:rPr>
-        <w:t>VietQR</w:t>
-      </w:r>
-      <w:proofErr w:type="spellEnd"/>
-      <w:r>
-        <w:rPr>
-          <w:szCs w:val="32"/>
-        </w:rPr>
-        <w:t xml:space="preserve"> sends a payment callback to AIMS software</w:t>
-      </w:r>
-      <w:r>
-        <w:rPr>
-          <w:szCs w:val="32"/>
-        </w:rPr>
         <w:t xml:space="preserve"> </w:t>
-      </w:r>
-      <w:r>
-        <w:rPr>
-          <w:szCs w:val="32"/>
-        </w:rPr>
-        <w:t>through the Transaction Sync API</w:t>
-      </w:r>
-      <w:r>
-        <w:rPr>
-          <w:szCs w:val="32"/>
-        </w:rPr>
-        <w:t xml:space="preserve"> (See Table 2)</w:t>
       </w:r>
     </w:p>
     <w:p>
@@ -1027,35 +900,7 @@
               <w:rPr>
                 <w:sz w:val="20"/>
               </w:rPr>
-              <w:t xml:space="preserve">If the customer </w:t>
-            </w:r>
-            <w:proofErr w:type="gramStart"/>
-            <w:r>
-              <w:rPr>
-                <w:sz w:val="20"/>
-              </w:rPr>
-              <w:t>choose</w:t>
-            </w:r>
-            <w:proofErr w:type="gramEnd"/>
-            <w:r>
-              <w:rPr>
-                <w:sz w:val="20"/>
-              </w:rPr>
-              <w:t xml:space="preserve"> to </w:t>
-            </w:r>
-            <w:proofErr w:type="gramStart"/>
-            <w:r>
-              <w:rPr>
-                <w:sz w:val="20"/>
-              </w:rPr>
-              <w:t>pay</w:t>
-            </w:r>
-            <w:proofErr w:type="gramEnd"/>
-            <w:r>
-              <w:rPr>
-                <w:sz w:val="20"/>
-              </w:rPr>
-              <w:t xml:space="preserve"> order by credit card</w:t>
+              <w:t>If the customer choose to pay order by credit card</w:t>
             </w:r>
           </w:p>
         </w:tc>
@@ -1121,15 +966,15 @@
               <w:spacing w:before="119"/>
               <w:ind w:left="107"/>
               <w:rPr>
-                <w:sz w:val="20"/>
-              </w:rPr>
-            </w:pPr>
-            <w:r>
-              <w:rPr>
                 <w:spacing w:val="-5"/>
                 <w:sz w:val="20"/>
               </w:rPr>
-              <w:lastRenderedPageBreak/>
+            </w:pPr>
+            <w:r>
+              <w:rPr>
+                <w:spacing w:val="-5"/>
+                <w:sz w:val="20"/>
+              </w:rPr>
               <w:t>2.</w:t>
             </w:r>
           </w:p>
@@ -1151,27 +996,7 @@
               <w:rPr>
                 <w:sz w:val="20"/>
               </w:rPr>
-              <w:t>At</w:t>
-            </w:r>
-            <w:r>
-              <w:rPr>
-                <w:spacing w:val="-5"/>
-                <w:sz w:val="20"/>
-              </w:rPr>
-              <w:t xml:space="preserve"> </w:t>
-            </w:r>
-            <w:r>
-              <w:rPr>
-                <w:sz w:val="20"/>
-              </w:rPr>
-              <w:t>Step</w:t>
-            </w:r>
-            <w:r>
-              <w:rPr>
-                <w:spacing w:val="-3"/>
-                <w:sz w:val="20"/>
-              </w:rPr>
-              <w:t xml:space="preserve"> 6</w:t>
+              <w:t>At Step 6</w:t>
             </w:r>
           </w:p>
         </w:tc>
@@ -1192,7 +1017,19 @@
               <w:rPr>
                 <w:sz w:val="20"/>
               </w:rPr>
-              <w:t>If the callback information is invalid or cannot be verified</w:t>
+              <w:t>i</w:t>
+            </w:r>
+            <w:r>
+              <w:rPr>
+                <w:sz w:val="20"/>
+              </w:rPr>
+              <w:t xml:space="preserve">f the customer </w:t>
+            </w:r>
+            <w:r>
+              <w:rPr>
+                <w:sz w:val="20"/>
+              </w:rPr>
+              <w:t>wants to cancel the payment</w:t>
             </w:r>
           </w:p>
         </w:tc>
@@ -1208,27 +1045,44 @@
               </w:tabs>
               <w:spacing w:before="119"/>
               <w:ind w:left="101" w:right="101"/>
+            </w:pPr>
+            <w:r>
               <w:rPr>
                 <w:sz w:val="20"/>
               </w:rPr>
-            </w:pPr>
+              <w:t>AIMS Software</w:t>
+            </w:r>
             <w:r>
               <w:rPr>
                 <w:sz w:val="20"/>
               </w:rPr>
-              <w:t xml:space="preserve">AIMS </w:t>
+              <w:t xml:space="preserve"> navigates </w:t>
             </w:r>
             <w:r>
               <w:rPr>
                 <w:sz w:val="20"/>
               </w:rPr>
-              <w:t xml:space="preserve">Software </w:t>
+              <w:t xml:space="preserve">the customer </w:t>
             </w:r>
             <w:r>
               <w:rPr>
                 <w:sz w:val="20"/>
               </w:rPr>
-              <w:t>does not confirm the payment</w:t>
+              <w:t xml:space="preserve">back to the </w:t>
+            </w:r>
+            <w:r>
+              <w:rPr>
+                <w:sz w:val="20"/>
+                <w:szCs w:val="20"/>
+              </w:rPr>
+              <w:t>Invoice Screen</w:t>
+            </w:r>
+            <w:r>
+              <w:rPr>
+                <w:sz w:val="20"/>
+                <w:szCs w:val="20"/>
+              </w:rPr>
+              <w:t xml:space="preserve"> and no order or payment made</w:t>
             </w:r>
           </w:p>
         </w:tc>
@@ -1249,34 +1103,122 @@
               <w:rPr>
                 <w:sz w:val="20"/>
               </w:rPr>
-              <w:t>Use</w:t>
-            </w:r>
-            <w:r>
-              <w:rPr>
-                <w:spacing w:val="-3"/>
+              <w:t>Use case ends</w:t>
+            </w:r>
+          </w:p>
+        </w:tc>
+      </w:tr>
+      <w:tr>
+        <w:trPr>
+          <w:trHeight w:val="980"/>
+        </w:trPr>
+        <w:tc>
+          <w:tcPr>
+            <w:tcW w:w="609" w:type="dxa"/>
+          </w:tcPr>
+          <w:p>
+            <w:pPr>
+              <w:pStyle w:val="TableParagraph"/>
+              <w:spacing w:before="119"/>
+              <w:ind w:left="107"/>
+              <w:rPr>
+                <w:spacing w:val="-5"/>
                 <w:sz w:val="20"/>
               </w:rPr>
-              <w:t xml:space="preserve"> </w:t>
-            </w:r>
+            </w:pPr>
             <w:r>
               <w:rPr>
                 <w:sz w:val="20"/>
               </w:rPr>
-              <w:t>case</w:t>
-            </w:r>
-            <w:r>
-              <w:rPr>
-                <w:spacing w:val="-3"/>
+              <w:lastRenderedPageBreak/>
+              <w:t>3.</w:t>
+            </w:r>
+          </w:p>
+        </w:tc>
+        <w:tc>
+          <w:tcPr>
+            <w:tcW w:w="1156" w:type="dxa"/>
+          </w:tcPr>
+          <w:p>
+            <w:pPr>
+              <w:pStyle w:val="TableParagraph"/>
+              <w:spacing w:before="119"/>
+              <w:ind w:left="108"/>
+              <w:rPr>
                 <w:sz w:val="20"/>
               </w:rPr>
-              <w:t xml:space="preserve"> </w:t>
-            </w:r>
-            <w:r>
-              <w:rPr>
-                <w:spacing w:val="-4"/>
+            </w:pPr>
+            <w:r>
+              <w:rPr>
                 <w:sz w:val="20"/>
               </w:rPr>
-              <w:t>ends</w:t>
+              <w:t>At Step 9</w:t>
+            </w:r>
+          </w:p>
+        </w:tc>
+        <w:tc>
+          <w:tcPr>
+            <w:tcW w:w="2171" w:type="dxa"/>
+          </w:tcPr>
+          <w:p>
+            <w:pPr>
+              <w:pStyle w:val="TableParagraph"/>
+              <w:spacing w:before="119"/>
+              <w:ind w:left="106" w:right="101"/>
+              <w:rPr>
+                <w:sz w:val="20"/>
+              </w:rPr>
+            </w:pPr>
+            <w:r>
+              <w:rPr>
+                <w:sz w:val="20"/>
+              </w:rPr>
+              <w:t>If the payment callback indicates a failed transaction</w:t>
+            </w:r>
+          </w:p>
+        </w:tc>
+        <w:tc>
+          <w:tcPr>
+            <w:tcW w:w="2430" w:type="dxa"/>
+          </w:tcPr>
+          <w:p>
+            <w:pPr>
+              <w:pStyle w:val="TableParagraph"/>
+              <w:tabs>
+                <w:tab w:val="left" w:pos="466"/>
+              </w:tabs>
+              <w:spacing w:before="119"/>
+              <w:ind w:left="101" w:right="101"/>
+              <w:rPr>
+                <w:sz w:val="20"/>
+              </w:rPr>
+            </w:pPr>
+            <w:r>
+              <w:rPr>
+                <w:sz w:val="20"/>
+              </w:rPr>
+              <w:t>Aims software notifies the customer that the transaction has failed</w:t>
+            </w:r>
+          </w:p>
+        </w:tc>
+        <w:tc>
+          <w:tcPr>
+            <w:tcW w:w="2595" w:type="dxa"/>
+          </w:tcPr>
+          <w:p>
+            <w:pPr>
+              <w:pStyle w:val="TableParagraph"/>
+              <w:spacing w:before="119"/>
+              <w:ind w:left="109"/>
+              <w:rPr>
+                <w:sz w:val="20"/>
+              </w:rPr>
+            </w:pPr>
+            <w:r>
+              <w:rPr>
+                <w:sz w:val="20"/>
+              </w:rPr>
+              <w:t>Resumes at Step 6</w:t>
             </w:r>
           </w:p>
         </w:tc>
@@ -1323,31 +1265,13 @@
         </w:rPr>
       </w:pPr>
       <w:r>
-        <w:t xml:space="preserve">Table 1-Input data </w:t>
-      </w:r>
-      <w:proofErr w:type="gramStart"/>
-      <w:r>
-        <w:t xml:space="preserve">of  </w:t>
-      </w:r>
-      <w:proofErr w:type="spellStart"/>
-      <w:r>
-        <w:t>VietQR</w:t>
-      </w:r>
-      <w:proofErr w:type="spellEnd"/>
-      <w:proofErr w:type="gramEnd"/>
-      <w:r>
-        <w:t xml:space="preserve"> code generation</w:t>
-      </w:r>
-      <w:r>
-        <w:t xml:space="preserve"> API (</w:t>
-      </w:r>
-      <w:proofErr w:type="spellStart"/>
-      <w:r>
-        <w:t>VietQR</w:t>
-      </w:r>
-      <w:proofErr w:type="spellEnd"/>
-      <w:r>
-        <w:t xml:space="preserve"> system)</w:t>
+        <w:t xml:space="preserve">Table 1-Input data of  </w:t>
+      </w:r>
+      <w:r>
+        <w:t>QR code generation</w:t>
+      </w:r>
+      <w:r>
+        <w:t xml:space="preserve"> API (VietQR system)</w:t>
       </w:r>
     </w:p>
     <w:tbl>
@@ -1521,7 +1445,6 @@
             <w:vAlign w:val="center"/>
           </w:tcPr>
           <w:p>
-            <w:proofErr w:type="spellStart"/>
             <w:r>
               <w:rPr>
                 <w:lang w:val="en-US"/>
@@ -1534,7 +1457,6 @@
               </w:rPr>
               <w:t>ankCode</w:t>
             </w:r>
-            <w:proofErr w:type="spellEnd"/>
           </w:p>
         </w:tc>
         <w:tc>
@@ -1581,16 +1503,8 @@
               <w:rPr>
                 <w:lang w:val="en-US"/>
               </w:rPr>
-              <w:t xml:space="preserve">alid bank code supported by </w:t>
-            </w:r>
-            <w:proofErr w:type="spellStart"/>
-            <w:r>
-              <w:rPr>
-                <w:lang w:val="en-US"/>
-              </w:rPr>
-              <w:t>VietQR</w:t>
-            </w:r>
-            <w:proofErr w:type="spellEnd"/>
+              <w:t>alid bank code supported by VietQR</w:t>
+            </w:r>
           </w:p>
         </w:tc>
         <w:tc>
@@ -1630,7 +1544,6 @@
             <w:vAlign w:val="center"/>
           </w:tcPr>
           <w:p>
-            <w:proofErr w:type="spellStart"/>
             <w:r>
               <w:rPr>
                 <w:lang w:val="en-US"/>
@@ -1643,7 +1556,6 @@
               </w:rPr>
               <w:t>ankAccount</w:t>
             </w:r>
-            <w:proofErr w:type="spellEnd"/>
           </w:p>
         </w:tc>
         <w:tc>
@@ -1828,7 +1740,6 @@
             <w:vAlign w:val="center"/>
           </w:tcPr>
           <w:p>
-            <w:proofErr w:type="spellStart"/>
             <w:r>
               <w:rPr>
                 <w:lang w:val="en-US"/>
@@ -1841,7 +1752,6 @@
               </w:rPr>
               <w:t>serBankName</w:t>
             </w:r>
-            <w:proofErr w:type="spellEnd"/>
           </w:p>
         </w:tc>
         <w:tc>
@@ -2021,11 +1931,16 @@
             <w:vAlign w:val="center"/>
           </w:tcPr>
           <w:p>
-            <w:r>
-              <w:rPr>
-                <w:lang w:val="en-US"/>
-              </w:rPr>
-              <w:t>PAYORDER01</w:t>
+            <w:pPr>
+              <w:rPr>
+                <w:lang w:val="en-US"/>
+              </w:rPr>
+            </w:pPr>
+            <w:r>
+              <w:rPr>
+                <w:lang w:val="en-US"/>
+              </w:rPr>
+              <w:t>ORDER112</w:t>
             </w:r>
           </w:p>
         </w:tc>
@@ -2052,14 +1967,12 @@
             <w:vAlign w:val="center"/>
           </w:tcPr>
           <w:p>
-            <w:proofErr w:type="spellStart"/>
             <w:r>
               <w:rPr>
                 <w:lang w:val="en-US"/>
               </w:rPr>
               <w:t>qrType</w:t>
             </w:r>
-            <w:proofErr w:type="spellEnd"/>
           </w:p>
         </w:tc>
         <w:tc>
@@ -2072,21 +1985,7 @@
               <w:rPr>
                 <w:lang w:val="en-US"/>
               </w:rPr>
-              <w:t xml:space="preserve">Type of </w:t>
-            </w:r>
-            <w:proofErr w:type="spellStart"/>
-            <w:r>
-              <w:rPr>
-                <w:lang w:val="en-US"/>
-              </w:rPr>
-              <w:t>VietQR</w:t>
-            </w:r>
-            <w:proofErr w:type="spellEnd"/>
-            <w:r>
-              <w:rPr>
-                <w:lang w:val="en-US"/>
-              </w:rPr>
-              <w:t xml:space="preserve"> code to generate</w:t>
+              <w:t>Type of VietQR code to generate</w:t>
             </w:r>
           </w:p>
         </w:tc>
@@ -2300,33 +2199,11 @@
               </w:rPr>
               <w:t xml:space="preserve">- </w:t>
             </w:r>
-            <w:proofErr w:type="spellStart"/>
-            <w:r>
-              <w:rPr>
-                <w:lang w:val="en-US"/>
-              </w:rPr>
-              <w:t>qrType</w:t>
-            </w:r>
-            <w:proofErr w:type="spellEnd"/>
-            <w:r>
-              <w:rPr>
-                <w:lang w:val="en-US"/>
-              </w:rPr>
-              <w:t xml:space="preserve"> = 0 or </w:t>
-            </w:r>
-            <w:proofErr w:type="spellStart"/>
-            <w:r>
-              <w:rPr>
-                <w:lang w:val="en-US"/>
-              </w:rPr>
-              <w:t>qrType</w:t>
-            </w:r>
-            <w:proofErr w:type="spellEnd"/>
-            <w:r>
-              <w:rPr>
-                <w:lang w:val="en-US"/>
-              </w:rPr>
-              <w:t xml:space="preserve"> = 3</w:t>
+            <w:r>
+              <w:rPr>
+                <w:lang w:val="en-US"/>
+              </w:rPr>
+              <w:t>qrType = 0 or qrType = 3</w:t>
             </w:r>
             <w:r>
               <w:rPr>
@@ -2373,6 +2250,115 @@
                 <w:lang w:val="en-US"/>
               </w:rPr>
               <w:t>000</w:t>
+            </w:r>
+          </w:p>
+        </w:tc>
+      </w:tr>
+      <w:tr>
+        <w:tc>
+          <w:tcPr>
+            <w:tcW w:w="529" w:type="dxa"/>
+            <w:vAlign w:val="center"/>
+          </w:tcPr>
+          <w:p>
+            <w:pPr>
+              <w:numPr>
+                <w:ilvl w:val="0"/>
+                <w:numId w:val="3"/>
+              </w:numPr>
+              <w:spacing w:after="120"/>
+            </w:pPr>
+          </w:p>
+        </w:tc>
+        <w:tc>
+          <w:tcPr>
+            <w:tcW w:w="1494" w:type="dxa"/>
+            <w:vAlign w:val="center"/>
+          </w:tcPr>
+          <w:p>
+            <w:pPr>
+              <w:rPr>
+                <w:lang w:val="en-US"/>
+              </w:rPr>
+            </w:pPr>
+            <w:r>
+              <w:rPr>
+                <w:lang w:val="en-US"/>
+              </w:rPr>
+              <w:t>O</w:t>
+            </w:r>
+            <w:r>
+              <w:rPr>
+                <w:lang w:val="en-US"/>
+              </w:rPr>
+              <w:t>rderId</w:t>
+            </w:r>
+          </w:p>
+        </w:tc>
+        <w:tc>
+          <w:tcPr>
+            <w:tcW w:w="1475" w:type="dxa"/>
+            <w:vAlign w:val="center"/>
+          </w:tcPr>
+          <w:p>
+            <w:r>
+              <w:rPr>
+                <w:lang w:val="en-US"/>
+              </w:rPr>
+              <w:t>U</w:t>
+            </w:r>
+            <w:r>
+              <w:rPr>
+                <w:lang w:val="en-US"/>
+              </w:rPr>
+              <w:t>nique identifier of the order</w:t>
+            </w:r>
+          </w:p>
+        </w:tc>
+        <w:tc>
+          <w:tcPr>
+            <w:tcW w:w="1337" w:type="dxa"/>
+            <w:vAlign w:val="center"/>
+          </w:tcPr>
+          <w:p>
+            <w:pPr>
+              <w:rPr>
+                <w:lang w:val="en-US"/>
+              </w:rPr>
+            </w:pPr>
+            <w:r>
+              <w:rPr>
+                <w:lang w:val="en-US"/>
+              </w:rPr>
+              <w:t>No</w:t>
+            </w:r>
+          </w:p>
+        </w:tc>
+        <w:tc>
+          <w:tcPr>
+            <w:tcW w:w="1911" w:type="dxa"/>
+            <w:vAlign w:val="center"/>
+          </w:tcPr>
+          <w:p>
+            <w:r>
+              <w:rPr>
+                <w:lang w:val="en-US"/>
+              </w:rPr>
+              <w:t>≤ 13 characters</w:t>
+            </w:r>
+          </w:p>
+        </w:tc>
+        <w:tc>
+          <w:tcPr>
+            <w:tcW w:w="2339" w:type="dxa"/>
+            <w:vAlign w:val="center"/>
+          </w:tcPr>
+          <w:p>
+            <w:r>
+              <w:rPr>
+                <w:lang w:val="en-US"/>
+              </w:rPr>
+              <w:t>ORDER001</w:t>
             </w:r>
           </w:p>
         </w:tc>
@@ -2387,7 +2373,19 @@
         </w:rPr>
       </w:pPr>
       <w:r>
-        <w:t>Table 2-Input data of Aims Transaction Sync API</w:t>
+        <w:t xml:space="preserve">Table 2-Input data of </w:t>
+      </w:r>
+      <w:r>
+        <w:t xml:space="preserve">VietQR </w:t>
+      </w:r>
+      <w:r>
+        <w:t>Test Callback</w:t>
+      </w:r>
+      <w:r>
+        <w:t xml:space="preserve"> API</w:t>
+      </w:r>
+      <w:r>
+        <w:t xml:space="preserve"> (VietQR system)</w:t>
       </w:r>
     </w:p>
     <w:tbl>
@@ -2566,7 +2564,6 @@
             <w:vAlign w:val="center"/>
           </w:tcPr>
           <w:p>
-            <w:proofErr w:type="spellStart"/>
             <w:r>
               <w:rPr>
                 <w:lang w:val="en-US"/>
@@ -2579,7 +2576,6 @@
               </w:rPr>
               <w:t>ankAccount</w:t>
             </w:r>
-            <w:proofErr w:type="spellEnd"/>
           </w:p>
         </w:tc>
         <w:tc>
@@ -2751,15 +2747,104 @@
           <w:p>
             <w:pPr>
               <w:spacing w:after="120"/>
-              <w:rPr>
-                <w:lang w:val="en-US"/>
-              </w:rPr>
             </w:pPr>
             <w:r>
               <w:rPr>
                 <w:lang w:val="en-US"/>
               </w:rPr>
               <w:t>2.</w:t>
+            </w:r>
+          </w:p>
+        </w:tc>
+        <w:tc>
+          <w:tcPr>
+            <w:tcW w:w="1494" w:type="dxa"/>
+            <w:vAlign w:val="center"/>
+          </w:tcPr>
+          <w:p>
+            <w:r>
+              <w:rPr>
+                <w:lang w:val="en-US"/>
+              </w:rPr>
+              <w:t>C</w:t>
+            </w:r>
+            <w:r>
+              <w:rPr>
+                <w:lang w:val="en-US"/>
+              </w:rPr>
+              <w:t>ontent</w:t>
+            </w:r>
+          </w:p>
+        </w:tc>
+        <w:tc>
+          <w:tcPr>
+            <w:tcW w:w="1475" w:type="dxa"/>
+            <w:vAlign w:val="center"/>
+          </w:tcPr>
+          <w:p>
+            <w:r>
+              <w:rPr>
+                <w:lang w:val="en-US"/>
+              </w:rPr>
+              <w:t>Payment transfer content</w:t>
+            </w:r>
+          </w:p>
+        </w:tc>
+        <w:tc>
+          <w:tcPr>
+            <w:tcW w:w="1337" w:type="dxa"/>
+            <w:vAlign w:val="center"/>
+          </w:tcPr>
+          <w:p>
+            <w:r>
+              <w:rPr>
+                <w:lang w:val="en-US"/>
+              </w:rPr>
+              <w:t>Yes</w:t>
+            </w:r>
+          </w:p>
+        </w:tc>
+        <w:tc>
+          <w:tcPr>
+            <w:tcW w:w="1911" w:type="dxa"/>
+            <w:vAlign w:val="center"/>
+          </w:tcPr>
+          <w:p/>
+        </w:tc>
+        <w:tc>
+          <w:tcPr>
+            <w:tcW w:w="2339" w:type="dxa"/>
+            <w:vAlign w:val="center"/>
+          </w:tcPr>
+          <w:p>
+            <w:r>
+              <w:rPr>
+                <w:lang w:val="en-US"/>
+              </w:rPr>
+              <w:t>ORDER112</w:t>
+            </w:r>
+          </w:p>
+        </w:tc>
+      </w:tr>
+      <w:tr>
+        <w:tc>
+          <w:tcPr>
+            <w:tcW w:w="529" w:type="dxa"/>
+            <w:vAlign w:val="center"/>
+          </w:tcPr>
+          <w:p>
+            <w:pPr>
+              <w:spacing w:after="120"/>
+              <w:rPr>
+                <w:lang w:val="en-US"/>
+              </w:rPr>
+            </w:pPr>
+            <w:r>
+              <w:rPr>
+                <w:lang w:val="en-US"/>
+              </w:rPr>
+              <w:lastRenderedPageBreak/>
+              <w:t>3.</w:t>
             </w:r>
           </w:p>
         </w:tc>
@@ -2920,8 +3005,7 @@
               <w:rPr>
                 <w:lang w:val="en-US"/>
               </w:rPr>
-              <w:lastRenderedPageBreak/>
-              <w:t>3.</w:t>
+              <w:t>4.</w:t>
             </w:r>
           </w:p>
         </w:tc>
@@ -2931,7 +3015,6 @@
             <w:vAlign w:val="center"/>
           </w:tcPr>
           <w:p>
-            <w:proofErr w:type="spellStart"/>
             <w:r>
               <w:rPr>
                 <w:lang w:val="en-US"/>
@@ -2944,7 +3027,6 @@
               </w:rPr>
               <w:t>ransType</w:t>
             </w:r>
-            <w:proofErr w:type="spellEnd"/>
           </w:p>
         </w:tc>
         <w:tc>
@@ -3021,7 +3103,7 @@
               <w:rPr>
                 <w:lang w:val="en-US"/>
               </w:rPr>
-              <w:t>4.</w:t>
+              <w:t>5.</w:t>
             </w:r>
           </w:p>
         </w:tc>
@@ -3035,13 +3117,13 @@
               <w:rPr>
                 <w:lang w:val="en-US"/>
               </w:rPr>
-              <w:t>C</w:t>
-            </w:r>
-            <w:r>
-              <w:rPr>
-                <w:lang w:val="en-US"/>
-              </w:rPr>
-              <w:t>ontent</w:t>
+              <w:t>B</w:t>
+            </w:r>
+            <w:r>
+              <w:rPr>
+                <w:lang w:val="en-US"/>
+              </w:rPr>
+              <w:t>ankCode</w:t>
             </w:r>
           </w:p>
         </w:tc>
@@ -3055,7 +3137,7 @@
               <w:rPr>
                 <w:lang w:val="en-US"/>
               </w:rPr>
-              <w:t>Payment transfer content</w:t>
+              <w:t>Code of the receiving bank account</w:t>
             </w:r>
           </w:p>
         </w:tc>
@@ -3078,7 +3160,20 @@
             <w:tcW w:w="1911" w:type="dxa"/>
             <w:vAlign w:val="center"/>
           </w:tcPr>
-          <w:p/>
+          <w:p>
+            <w:r>
+              <w:rPr>
+                <w:lang w:val="en-US"/>
+              </w:rPr>
+              <w:t>V</w:t>
+            </w:r>
+            <w:r>
+              <w:rPr>
+                <w:lang w:val="en-US"/>
+              </w:rPr>
+              <w:t>alid bank code supported by VietQR</w:t>
+            </w:r>
+          </w:p>
         </w:tc>
         <w:tc>
           <w:tcPr>
@@ -3090,634 +3185,7 @@
               <w:rPr>
                 <w:lang w:val="en-US"/>
               </w:rPr>
-              <w:t>PAYORD</w:t>
-            </w:r>
-            <w:r>
-              <w:rPr>
-                <w:lang w:val="en-US"/>
-              </w:rPr>
-              <w:t>ER</w:t>
-            </w:r>
-            <w:r>
-              <w:rPr>
-                <w:lang w:val="en-US"/>
-              </w:rPr>
-              <w:t>001</w:t>
-            </w:r>
-          </w:p>
-        </w:tc>
-      </w:tr>
-      <w:tr>
-        <w:tc>
-          <w:tcPr>
-            <w:tcW w:w="529" w:type="dxa"/>
-            <w:vAlign w:val="center"/>
-          </w:tcPr>
-          <w:p>
-            <w:pPr>
-              <w:spacing w:after="120"/>
-              <w:rPr>
-                <w:lang w:val="en-US"/>
-              </w:rPr>
-            </w:pPr>
-            <w:r>
-              <w:rPr>
-                <w:lang w:val="en-US"/>
-              </w:rPr>
-              <w:t>5.</w:t>
-            </w:r>
-          </w:p>
-        </w:tc>
-        <w:tc>
-          <w:tcPr>
-            <w:tcW w:w="1494" w:type="dxa"/>
-            <w:vAlign w:val="center"/>
-          </w:tcPr>
-          <w:p>
-            <w:r>
-              <w:rPr>
-                <w:lang w:val="en-US"/>
-              </w:rPr>
-              <w:t>T</w:t>
-            </w:r>
-            <w:r>
-              <w:rPr>
-                <w:lang w:val="en-US"/>
-              </w:rPr>
-              <w:t>ransaction</w:t>
-            </w:r>
-            <w:r>
-              <w:rPr>
-                <w:lang w:val="en-US"/>
-              </w:rPr>
-              <w:t xml:space="preserve"> ID</w:t>
-            </w:r>
-          </w:p>
-        </w:tc>
-        <w:tc>
-          <w:tcPr>
-            <w:tcW w:w="1475" w:type="dxa"/>
-            <w:vAlign w:val="center"/>
-          </w:tcPr>
-          <w:p>
-            <w:r>
-              <w:t>Total</w:t>
-            </w:r>
-            <w:r>
-              <w:rPr>
-                <w:spacing w:val="-12"/>
-              </w:rPr>
-              <w:t xml:space="preserve"> </w:t>
-            </w:r>
-            <w:r>
-              <w:t>money</w:t>
-            </w:r>
-            <w:r>
-              <w:rPr>
-                <w:spacing w:val="-11"/>
-              </w:rPr>
-              <w:t xml:space="preserve"> </w:t>
-            </w:r>
-            <w:r>
-              <w:rPr>
-                <w:sz w:val="22"/>
-              </w:rPr>
-              <w:t>of</w:t>
-            </w:r>
-            <w:r>
-              <w:rPr>
-                <w:spacing w:val="-12"/>
-                <w:sz w:val="22"/>
-              </w:rPr>
-              <w:t xml:space="preserve"> </w:t>
-            </w:r>
-            <w:r>
-              <w:rPr>
-                <w:sz w:val="22"/>
-              </w:rPr>
-              <w:t>the</w:t>
-            </w:r>
-            <w:r>
-              <w:rPr>
-                <w:spacing w:val="-12"/>
-                <w:sz w:val="22"/>
-              </w:rPr>
-              <w:t xml:space="preserve"> </w:t>
-            </w:r>
-            <w:r>
-              <w:rPr>
-                <w:sz w:val="22"/>
-              </w:rPr>
-              <w:t xml:space="preserve">corresponding </w:t>
-            </w:r>
-            <w:r>
-              <w:rPr>
-                <w:spacing w:val="-4"/>
-                <w:sz w:val="22"/>
-              </w:rPr>
-              <w:t>media</w:t>
-            </w:r>
-          </w:p>
-        </w:tc>
-        <w:tc>
-          <w:tcPr>
-            <w:tcW w:w="1337" w:type="dxa"/>
-            <w:vAlign w:val="center"/>
-          </w:tcPr>
-          <w:p>
-            <w:pPr>
-              <w:rPr>
-                <w:lang w:val="en-US"/>
-              </w:rPr>
-            </w:pPr>
-            <w:r>
-              <w:rPr>
-                <w:lang w:val="en-US"/>
-              </w:rPr>
-              <w:t>No</w:t>
-            </w:r>
-          </w:p>
-        </w:tc>
-        <w:tc>
-          <w:tcPr>
-            <w:tcW w:w="1911" w:type="dxa"/>
-            <w:vAlign w:val="center"/>
-          </w:tcPr>
-          <w:p/>
-        </w:tc>
-        <w:tc>
-          <w:tcPr>
-            <w:tcW w:w="2339" w:type="dxa"/>
-            <w:vAlign w:val="center"/>
-          </w:tcPr>
-          <w:tbl>
-            <w:tblPr>
-              <w:tblW w:w="0" w:type="auto"/>
-              <w:tblCellSpacing w:w="15" w:type="dxa"/>
-              <w:tblCellMar>
-                <w:top w:w="15" w:type="dxa"/>
-                <w:left w:w="15" w:type="dxa"/>
-                <w:bottom w:w="15" w:type="dxa"/>
-                <w:right w:w="15" w:type="dxa"/>
-              </w:tblCellMar>
-              <w:tblLook w:val="04A0" w:firstRow="1" w:lastRow="0" w:firstColumn="1" w:lastColumn="0" w:noHBand="0" w:noVBand="1"/>
-            </w:tblPr>
-            <w:tblGrid>
-              <w:gridCol w:w="96"/>
-            </w:tblGrid>
-            <w:tr>
-              <w:trPr>
-                <w:tblCellSpacing w:w="15" w:type="dxa"/>
-              </w:trPr>
-              <w:tc>
-                <w:tcPr>
-                  <w:tcW w:w="0" w:type="auto"/>
-                  <w:vAlign w:val="center"/>
-                  <w:hideMark/>
-                </w:tcPr>
-                <w:p>
-                  <w:pPr>
-                    <w:autoSpaceDE w:val="0"/>
-                    <w:autoSpaceDN w:val="0"/>
-                    <w:rPr>
-                      <w:sz w:val="20"/>
-                      <w:lang w:eastAsia="vi-VN"/>
-                    </w:rPr>
-                  </w:pPr>
-                </w:p>
-              </w:tc>
-            </w:tr>
-          </w:tbl>
-          <w:p>
-            <w:pPr>
-              <w:rPr>
-                <w:vanish/>
-              </w:rPr>
-            </w:pPr>
-          </w:p>
-          <w:tbl>
-            <w:tblPr>
-              <w:tblW w:w="0" w:type="auto"/>
-              <w:tblCellSpacing w:w="15" w:type="dxa"/>
-              <w:tblCellMar>
-                <w:top w:w="15" w:type="dxa"/>
-                <w:left w:w="15" w:type="dxa"/>
-                <w:bottom w:w="15" w:type="dxa"/>
-                <w:right w:w="15" w:type="dxa"/>
-              </w:tblCellMar>
-              <w:tblLook w:val="04A0" w:firstRow="1" w:lastRow="0" w:firstColumn="1" w:lastColumn="0" w:noHBand="0" w:noVBand="1"/>
-            </w:tblPr>
-            <w:tblGrid>
-              <w:gridCol w:w="957"/>
-            </w:tblGrid>
-            <w:tr>
-              <w:trPr>
-                <w:tblCellSpacing w:w="15" w:type="dxa"/>
-              </w:trPr>
-              <w:tc>
-                <w:tcPr>
-                  <w:tcW w:w="0" w:type="auto"/>
-                  <w:vAlign w:val="center"/>
-                  <w:hideMark/>
-                </w:tcPr>
-                <w:p>
-                  <w:pPr>
-                    <w:autoSpaceDE w:val="0"/>
-                    <w:autoSpaceDN w:val="0"/>
-                    <w:rPr>
-                      <w:sz w:val="20"/>
-                      <w:lang w:eastAsia="vi-VN"/>
-                    </w:rPr>
-                  </w:pPr>
-                  <w:r>
-                    <w:rPr>
-                      <w:sz w:val="20"/>
-                      <w:lang w:eastAsia="vi-VN"/>
-                    </w:rPr>
-                    <w:t>TX123456</w:t>
-                  </w:r>
-                </w:p>
-              </w:tc>
-            </w:tr>
-          </w:tbl>
-          <w:p/>
-        </w:tc>
-      </w:tr>
-      <w:tr>
-        <w:tc>
-          <w:tcPr>
-            <w:tcW w:w="529" w:type="dxa"/>
-            <w:vAlign w:val="center"/>
-          </w:tcPr>
-          <w:p>
-            <w:pPr>
-              <w:spacing w:after="120"/>
-              <w:rPr>
-                <w:lang w:val="en-US"/>
-              </w:rPr>
-            </w:pPr>
-            <w:r>
-              <w:rPr>
-                <w:lang w:val="en-US"/>
-              </w:rPr>
-              <w:t>6.</w:t>
-            </w:r>
-          </w:p>
-        </w:tc>
-        <w:tc>
-          <w:tcPr>
-            <w:tcW w:w="1494" w:type="dxa"/>
-            <w:vAlign w:val="center"/>
-          </w:tcPr>
-          <w:p>
-            <w:pPr>
-              <w:rPr>
-                <w:lang w:val="en-US"/>
-              </w:rPr>
-            </w:pPr>
-            <w:r>
-              <w:rPr>
-                <w:lang w:val="en-US"/>
-              </w:rPr>
-              <w:t>Transaction</w:t>
-            </w:r>
-            <w:r>
-              <w:rPr>
-                <w:lang w:val="en-US"/>
-              </w:rPr>
-              <w:t xml:space="preserve"> Time</w:t>
-            </w:r>
-          </w:p>
-        </w:tc>
-        <w:tc>
-          <w:tcPr>
-            <w:tcW w:w="1475" w:type="dxa"/>
-            <w:vAlign w:val="center"/>
-          </w:tcPr>
-          <w:p>
-            <w:r>
-              <w:rPr>
-                <w:lang w:val="en-US"/>
-              </w:rPr>
-              <w:t>Timestamp when the payment</w:t>
-            </w:r>
-            <w:r>
-              <w:rPr>
-                <w:lang w:val="en-US"/>
-              </w:rPr>
-              <w:t xml:space="preserve"> occured</w:t>
-            </w:r>
-          </w:p>
-        </w:tc>
-        <w:tc>
-          <w:tcPr>
-            <w:tcW w:w="1337" w:type="dxa"/>
-            <w:vAlign w:val="center"/>
-          </w:tcPr>
-          <w:p>
-            <w:pPr>
-              <w:rPr>
-                <w:lang w:val="en-US"/>
-              </w:rPr>
-            </w:pPr>
-            <w:r>
-              <w:rPr>
-                <w:lang w:val="en-US"/>
-              </w:rPr>
-              <w:t>No</w:t>
-            </w:r>
-          </w:p>
-        </w:tc>
-        <w:tc>
-          <w:tcPr>
-            <w:tcW w:w="1911" w:type="dxa"/>
-            <w:vAlign w:val="center"/>
-          </w:tcPr>
-          <w:tbl>
-            <w:tblPr>
-              <w:tblW w:w="0" w:type="auto"/>
-              <w:tblCellSpacing w:w="15" w:type="dxa"/>
-              <w:tblCellMar>
-                <w:top w:w="15" w:type="dxa"/>
-                <w:left w:w="15" w:type="dxa"/>
-                <w:bottom w:w="15" w:type="dxa"/>
-                <w:right w:w="15" w:type="dxa"/>
-              </w:tblCellMar>
-              <w:tblLook w:val="04A0" w:firstRow="1" w:lastRow="0" w:firstColumn="1" w:lastColumn="0" w:noHBand="0" w:noVBand="1"/>
-            </w:tblPr>
-            <w:tblGrid>
-              <w:gridCol w:w="96"/>
-            </w:tblGrid>
-            <w:tr>
-              <w:trPr>
-                <w:tblCellSpacing w:w="15" w:type="dxa"/>
-              </w:trPr>
-              <w:tc>
-                <w:tcPr>
-                  <w:tcW w:w="0" w:type="auto"/>
-                  <w:vAlign w:val="center"/>
-                  <w:hideMark/>
-                </w:tcPr>
-                <w:p>
-                  <w:pPr>
-                    <w:autoSpaceDE w:val="0"/>
-                    <w:autoSpaceDN w:val="0"/>
-                    <w:rPr>
-                      <w:sz w:val="20"/>
-                      <w:lang w:eastAsia="vi-VN"/>
-                    </w:rPr>
-                  </w:pPr>
-                </w:p>
-              </w:tc>
-            </w:tr>
-          </w:tbl>
-          <w:p>
-            <w:pPr>
-              <w:rPr>
-                <w:vanish/>
-                <w:lang w:val="en-US"/>
-              </w:rPr>
-            </w:pPr>
-          </w:p>
-          <w:tbl>
-            <w:tblPr>
-              <w:tblW w:w="0" w:type="auto"/>
-              <w:tblCellSpacing w:w="15" w:type="dxa"/>
-              <w:tblCellMar>
-                <w:top w:w="15" w:type="dxa"/>
-                <w:left w:w="15" w:type="dxa"/>
-                <w:bottom w:w="15" w:type="dxa"/>
-                <w:right w:w="15" w:type="dxa"/>
-              </w:tblCellMar>
-              <w:tblLook w:val="04A0" w:firstRow="1" w:lastRow="0" w:firstColumn="1" w:lastColumn="0" w:noHBand="0" w:noVBand="1"/>
-            </w:tblPr>
-            <w:tblGrid>
-              <w:gridCol w:w="1695"/>
-            </w:tblGrid>
-            <w:tr>
-              <w:trPr>
-                <w:tblCellSpacing w:w="15" w:type="dxa"/>
-              </w:trPr>
-              <w:tc>
-                <w:tcPr>
-                  <w:tcW w:w="0" w:type="auto"/>
-                  <w:vAlign w:val="center"/>
-                  <w:hideMark/>
-                </w:tcPr>
-                <w:p>
-                  <w:pPr>
-                    <w:autoSpaceDE w:val="0"/>
-                    <w:autoSpaceDN w:val="0"/>
-                    <w:rPr>
-                      <w:sz w:val="20"/>
-                      <w:lang w:eastAsia="vi-VN"/>
-                    </w:rPr>
-                  </w:pPr>
-                  <w:r>
-                    <w:rPr>
-                      <w:sz w:val="20"/>
-                      <w:lang w:eastAsia="vi-VN"/>
-                    </w:rPr>
-                    <w:t>Valid datetime format</w:t>
-                  </w:r>
-                </w:p>
-              </w:tc>
-            </w:tr>
-          </w:tbl>
-          <w:p/>
-        </w:tc>
-        <w:tc>
-          <w:tcPr>
-            <w:tcW w:w="2339" w:type="dxa"/>
-            <w:vAlign w:val="center"/>
-          </w:tcPr>
-          <w:p>
-            <w:r>
-              <w:rPr>
-                <w:lang w:val="en-US"/>
-              </w:rPr>
-              <w:t>16</w:t>
-            </w:r>
-            <w:r>
-              <w:rPr>
-                <w:lang w:val="en-US"/>
-              </w:rPr>
-              <w:t>/</w:t>
-            </w:r>
-            <w:r>
-              <w:rPr>
-                <w:lang w:val="en-US"/>
-              </w:rPr>
-              <w:t>03</w:t>
-            </w:r>
-            <w:r>
-              <w:rPr>
-                <w:lang w:val="en-US"/>
-              </w:rPr>
-              <w:t>/202</w:t>
-            </w:r>
-            <w:r>
-              <w:rPr>
-                <w:lang w:val="en-US"/>
-              </w:rPr>
-              <w:t>5</w:t>
-            </w:r>
-            <w:r>
-              <w:rPr>
-                <w:lang w:val="en-US"/>
-              </w:rPr>
-              <w:t xml:space="preserve"> 1</w:t>
-            </w:r>
-            <w:r>
-              <w:rPr>
-                <w:lang w:val="en-US"/>
-              </w:rPr>
-              <w:t>5</w:t>
-            </w:r>
-            <w:r>
-              <w:rPr>
-                <w:lang w:val="en-US"/>
-              </w:rPr>
-              <w:t>:</w:t>
-            </w:r>
-            <w:r>
-              <w:rPr>
-                <w:lang w:val="en-US"/>
-              </w:rPr>
-              <w:t>55</w:t>
-            </w:r>
-            <w:r>
-              <w:rPr>
-                <w:lang w:val="en-US"/>
-              </w:rPr>
-              <w:t>:</w:t>
-            </w:r>
-            <w:r>
-              <w:rPr>
-                <w:lang w:val="en-US"/>
-              </w:rPr>
-              <w:t>46</w:t>
-            </w:r>
-          </w:p>
-        </w:tc>
-      </w:tr>
-      <w:tr>
-        <w:tc>
-          <w:tcPr>
-            <w:tcW w:w="529" w:type="dxa"/>
-            <w:vAlign w:val="center"/>
-          </w:tcPr>
-          <w:p>
-            <w:pPr>
-              <w:pStyle w:val="ListParagraph"/>
-              <w:numPr>
-                <w:ilvl w:val="0"/>
-                <w:numId w:val="3"/>
-              </w:numPr>
-              <w:spacing w:after="120"/>
-              <w:rPr>
-                <w:lang w:val="en-US"/>
-              </w:rPr>
-            </w:pPr>
-          </w:p>
-        </w:tc>
-        <w:tc>
-          <w:tcPr>
-            <w:tcW w:w="1494" w:type="dxa"/>
-            <w:vAlign w:val="center"/>
-          </w:tcPr>
-          <w:p>
-            <w:proofErr w:type="spellStart"/>
-            <w:r>
-              <w:rPr>
-                <w:lang w:val="en-US"/>
-              </w:rPr>
-              <w:t>O</w:t>
-            </w:r>
-            <w:r>
-              <w:rPr>
-                <w:lang w:val="en-US"/>
-              </w:rPr>
-              <w:t>rderId</w:t>
-            </w:r>
-            <w:proofErr w:type="spellEnd"/>
-          </w:p>
-        </w:tc>
-        <w:tc>
-          <w:tcPr>
-            <w:tcW w:w="1475" w:type="dxa"/>
-            <w:vAlign w:val="center"/>
-          </w:tcPr>
-          <w:p>
-            <w:r>
-              <w:rPr>
-                <w:lang w:val="en-US"/>
-              </w:rPr>
-              <w:t>Identifier of the order</w:t>
-            </w:r>
-          </w:p>
-        </w:tc>
-        <w:tc>
-          <w:tcPr>
-            <w:tcW w:w="1337" w:type="dxa"/>
-            <w:vAlign w:val="center"/>
-          </w:tcPr>
-          <w:p>
-            <w:pPr>
-              <w:rPr>
-                <w:lang w:val="en-US"/>
-              </w:rPr>
-            </w:pPr>
-            <w:r>
-              <w:rPr>
-                <w:lang w:val="en-US"/>
-              </w:rPr>
-              <w:t>No</w:t>
-            </w:r>
-          </w:p>
-        </w:tc>
-        <w:tc>
-          <w:tcPr>
-            <w:tcW w:w="1911" w:type="dxa"/>
-            <w:vAlign w:val="center"/>
-          </w:tcPr>
-          <w:p>
-            <w:r>
-              <w:rPr>
-                <w:lang w:val="en-US"/>
-              </w:rPr>
-              <w:t>Maximum</w:t>
-            </w:r>
-            <w:r>
-              <w:rPr>
-                <w:lang w:val="en-US"/>
-              </w:rPr>
-              <w:t xml:space="preserve"> 19 characters</w:t>
-            </w:r>
-            <w:r>
-              <w:rPr>
-                <w:lang w:val="en-US"/>
-              </w:rPr>
-              <w:t>, no special characters</w:t>
-            </w:r>
-          </w:p>
-        </w:tc>
-        <w:tc>
-          <w:tcPr>
-            <w:tcW w:w="2339" w:type="dxa"/>
-            <w:vAlign w:val="center"/>
-          </w:tcPr>
-          <w:p>
-            <w:pPr>
-              <w:rPr>
-                <w:lang w:val="en-US"/>
-              </w:rPr>
-            </w:pPr>
-            <w:r>
-              <w:rPr>
-                <w:lang w:val="en-US"/>
-              </w:rPr>
-              <w:t>ORDERID01</w:t>
+              <w:t>MB</w:t>
             </w:r>
           </w:p>
         </w:tc>
@@ -3981,14 +3449,12 @@
             <w:vAlign w:val="center"/>
           </w:tcPr>
           <w:p>
-            <w:proofErr w:type="spellStart"/>
             <w:r>
               <w:rPr>
                 <w:lang w:val="en-US"/>
               </w:rPr>
               <w:t>VietinBank</w:t>
             </w:r>
-            <w:proofErr w:type="spellEnd"/>
           </w:p>
         </w:tc>
       </w:tr>
@@ -4108,7 +3574,6 @@
             <w:vAlign w:val="center"/>
           </w:tcPr>
           <w:p>
-            <w:proofErr w:type="spellStart"/>
             <w:r>
               <w:rPr>
                 <w:lang w:val="en-US"/>
@@ -4121,7 +3586,6 @@
               </w:rPr>
               <w:t>serBankName</w:t>
             </w:r>
-            <w:proofErr w:type="spellEnd"/>
           </w:p>
         </w:tc>
         <w:tc>
@@ -4574,23 +4038,7 @@
         <w:t>software will display general information of the order</w:t>
       </w:r>
       <w:r>
-        <w:t xml:space="preserve"> and transaction </w:t>
-      </w:r>
-      <w:proofErr w:type="gramStart"/>
-      <w:r>
-        <w:t>information, and</w:t>
-      </w:r>
-      <w:proofErr w:type="gramEnd"/>
-      <w:r>
-        <w:t xml:space="preserve"> then send </w:t>
-      </w:r>
-      <w:proofErr w:type="gramStart"/>
-      <w:r>
-        <w:t>invoice</w:t>
-      </w:r>
-      <w:proofErr w:type="gramEnd"/>
-      <w:r>
-        <w:t xml:space="preserve"> with </w:t>
+        <w:t xml:space="preserve"> and transaction information, and then send invoice with </w:t>
       </w:r>
       <w:r>
         <w:t>payment transaction information to the customer's email</w:t>
@@ -4599,30 +4047,6 @@
         <w:t>.</w:t>
       </w:r>
     </w:p>
-    <w:p>
-      <w:pPr>
-        <w:pStyle w:val="ListParagraph"/>
-        <w:spacing w:after="120"/>
-        <w:ind w:left="360"/>
-        <w:rPr>
-          <w:b/>
-          <w:bCs/>
-        </w:rPr>
-      </w:pPr>
-    </w:p>
-    <w:p/>
-    <w:p/>
-    <w:p/>
-    <w:p>
-      <w:pPr>
-        <w:spacing w:after="120"/>
-        <w:rPr>
-          <w:b/>
-          <w:bCs/>
-        </w:rPr>
-      </w:pPr>
-    </w:p>
-    <w:p/>
     <w:sectPr>
       <w:pgSz w:w="12240" w:h="15840"/>
       <w:pgMar w:top="1440" w:right="1440" w:bottom="1440" w:left="1440" w:header="720" w:footer="720" w:gutter="0"/>
@@ -5770,6 +5194,7 @@
   <w:style w:type="character" w:default="1" w:styleId="DefaultParagraphFont">
     <w:name w:val="Default Paragraph Font"/>
     <w:uiPriority w:val="1"/>
+    <w:semiHidden/>
     <w:unhideWhenUsed/>
   </w:style>
   <w:style w:type="table" w:default="1" w:styleId="TableNormal">
@@ -6144,6 +5569,37 @@
       </w:tblBorders>
     </w:tblPr>
   </w:style>
+  <w:style w:type="paragraph" w:styleId="HTMLPreformatted">
+    <w:name w:val="HTML Preformatted"/>
+    <w:basedOn w:val="Normal"/>
+    <w:link w:val="HTMLPreformattedChar"/>
+    <w:uiPriority w:val="99"/>
+    <w:semiHidden/>
+    <w:unhideWhenUsed/>
+    <w:rsid w:val="00B554F0"/>
+    <w:pPr>
+      <w:spacing w:before="0" w:line="240" w:lineRule="auto"/>
+    </w:pPr>
+    <w:rPr>
+      <w:rFonts w:ascii="Consolas" w:hAnsi="Consolas"/>
+      <w:sz w:val="20"/>
+    </w:rPr>
+  </w:style>
+  <w:style w:type="character" w:customStyle="1" w:styleId="HTMLPreformattedChar">
+    <w:name w:val="HTML Preformatted Char"/>
+    <w:basedOn w:val="DefaultParagraphFont"/>
+    <w:link w:val="HTMLPreformatted"/>
+    <w:uiPriority w:val="99"/>
+    <w:semiHidden/>
+    <w:rsid w:val="00B554F0"/>
+    <w:rPr>
+      <w:rFonts w:ascii="Consolas" w:eastAsia="Times New Roman" w:hAnsi="Consolas" w:cs="Times New Roman"/>
+      <w:kern w:val="0"/>
+      <w:sz w:val="20"/>
+      <w:szCs w:val="20"/>
+      <w14:ligatures w14:val="none"/>
+    </w:rPr>
+  </w:style>
 </w:styles>
 </file>
 
@@ -6460,4 +5916,16 @@
     </a:ext>
   </a:extLst>
 </a:theme>
+</file>
+
+<file path=customXml/item1.xml><?xml version="1.0" encoding="utf-8"?>
+<b:Sources xmlns:b="http://schemas.openxmlformats.org/officeDocument/2006/bibliography" xmlns="http://schemas.openxmlformats.org/officeDocument/2006/bibliography" SelectedStyle="\APASixthEditionOfficeOnline.xsl" StyleName="APA" Version="6"/>
+</file>
+
+<file path=customXml/itemProps1.xml><?xml version="1.0" encoding="utf-8"?>
+<ds:datastoreItem xmlns:ds="http://schemas.openxmlformats.org/officeDocument/2006/customXml" ds:itemID="{BE0A2AFE-7BB1-409C-B846-E22C975D3AD7}">
+  <ds:schemaRefs>
+    <ds:schemaRef ds:uri="http://schemas.openxmlformats.org/officeDocument/2006/bibliography"/>
+  </ds:schemaRefs>
+</ds:datastoreItem>
 </file>
</xml_diff>